<commit_message>
Revise report: concise technical bullets, remove sensitive operational details
</commit_message>
<xml_diff>
--- a/June_July_2026_REPORT_OOI_YU_ZHEN.docx
+++ b/June_July_2026_REPORT_OOI_YU_ZHEN.docx
@@ -227,7 +227,7 @@
                 <w:rFonts w:ascii="Times New Roman" w:hAnsi="Times New Roman"/>
                 <w:sz w:val="20"/>
               </w:rPr>
-              <w:t>Monitored the WhatsApp lorry assignment bot following its live deployment at the end of May. Observed the system handling real daily delivery order (DO) uploads from the logistics team, verified that assignment outputs and trip manifests were being delivered correctly to planners, and collected feedback from lorry coordinators on usability and accuracy of assignments.</w:t>
+              <w:t>Monitored the deployed WhatsApp-based lorry assignment system during its initial live operation period. Verified end-to-end message flow, file exchange, and assignment output correctness under real daily usage conditions.</w:t>
             </w:r>
           </w:p>
           <w:p>
@@ -240,7 +240,7 @@
                 <w:rFonts w:ascii="Times New Roman" w:hAnsi="Times New Roman"/>
                 <w:sz w:val="20"/>
               </w:rPr>
-              <w:t>Investigated early post-deployment issues flagged by the operations team, including cases where delivery orders with future-dated remarks were being incorrectly filtered out before the user-selected trip day, and cases where the daily assignment log was not persisting correctly between bot sessions. Identified root causes in the remarks day parser and session state handling.</w:t>
+              <w:t>Investigated and identified root causes for post-deployment defects surfaced during live usage, including incorrect date-based filtering in the remarks parser and session state persistence issues in the daily assignment log.</w:t>
             </w:r>
           </w:p>
           <w:p>
@@ -253,7 +253,7 @@
                 <w:rFonts w:ascii="Times New Roman" w:hAnsi="Times New Roman"/>
                 <w:sz w:val="20"/>
               </w:rPr>
-              <w:t>Reviewed the complete assignment rule set against real operational data from the first week of live usage, cross-referencing assigned lorries against planner expectations. Documented a shortlist of rule inconsistencies and edge cases to be addressed in subsequent development iterations, covering route boundary enforcement, lorry capacity utilisation thresholds, and preferred-lorry override behaviour.</w:t>
+              <w:t>Reviewed the full assignment rule set against live operational data and documented a prioritised list of rule inconsistencies and edge cases for the next development iteration.</w:t>
             </w:r>
           </w:p>
         </w:tc>
@@ -292,7 +292,7 @@
                 <w:rFonts w:ascii="Times New Roman" w:hAnsi="Times New Roman"/>
                 <w:sz w:val="20"/>
               </w:rPr>
-              <w:t>Added a route-direction guard to all DO consolidation and overflow assignment passes, preventing delivery orders from geographically opposite directions from being grouped onto the same lorry. This resolved a recurring complaint from lorry coordinators where a single lorry was being assigned stops spanning both the north and south corridors of the Klang Valley, causing excessive backtracking and longer trip durations.</w:t>
+              <w:t>Implemented a route-direction guard across all assignment and overflow passes to prevent geographically opposing delivery orders from being co-assigned to the same vehicle, resolving incorrect multi-directional grouping.</w:t>
             </w:r>
           </w:p>
           <w:p>
@@ -305,7 +305,7 @@
                 <w:rFonts w:ascii="Times New Roman" w:hAnsi="Times New Roman"/>
                 <w:sz w:val="20"/>
               </w:rPr>
-              <w:t>Fixed the lorry utilisation calculation to correctly enforce an 80% load threshold before triggering a LORRY NAIK (lorry upgrade) split. Corrected the fill-to-80% pass to ensure that partial loads are consolidated up to the utilisation target before a second lorry is assigned for the overflow, preventing under-loaded lorries from being dispatched unnecessarily.</w:t>
+              <w:t>Fixed the capacity utilisation threshold logic to correctly enforce an 80% load target before triggering a vehicle upgrade split, and corrected the fill pass to consolidate partial loads up to the threshold before allocating overflow to a second unit.</w:t>
             </w:r>
           </w:p>
           <w:p>
@@ -318,7 +318,7 @@
                 <w:rFonts w:ascii="Times New Roman" w:hAnsi="Times New Roman"/>
                 <w:sz w:val="20"/>
               </w:rPr>
-              <w:t>Implemented earliest-date-first prioritisation across all assignment passes, ensuring that delivery orders with earlier scheduled dates are always processed and assigned before later ones when the lorry fleet is at capacity. This prevents newer DOs from displacing older outstanding ones during high-volume days.</w:t>
+              <w:t>Added earliest-date-first ordering across all assignment passes to ensure older outstanding orders are prioritised over newer ones when fleet capacity is limited.</w:t>
             </w:r>
           </w:p>
           <w:p>
@@ -331,7 +331,7 @@
                 <w:rFonts w:ascii="Times New Roman" w:hAnsi="Times New Roman"/>
                 <w:sz w:val="20"/>
               </w:rPr>
-              <w:t>Strengthened the urban route guard to enforce corridor-group-only cross-route mixing for Klang Valley deliveries. Routes belonging to different geographic corridor groups are now strictly blocked from being merged onto the same lorry, even when both routes are classified as urban, closing a gap where KL and Selangor routes from opposite ends of the city were being co-assigned.</w:t>
+              <w:t>Tightened the urban route guard to enforce corridor-group-only merging, blocking cross-corridor co-assignment even between routes of the same classification.</w:t>
             </w:r>
           </w:p>
           <w:p>
@@ -344,7 +344,7 @@
                 <w:rFonts w:ascii="Times New Roman" w:hAnsi="Times New Roman"/>
                 <w:sz w:val="20"/>
               </w:rPr>
-              <w:t>Fixed the Tomorrow button flow to correctly include Saturday as a selectable working day while skipping Sunday only, in line with the company's Monday-to-Saturday operating schedule.</w:t>
+              <w:t>Fixed the date selection flow to correctly include Saturday as a working day while excluding Sunday only.</w:t>
             </w:r>
           </w:p>
         </w:tc>
@@ -383,7 +383,7 @@
                 <w:rFonts w:ascii="Times New Roman" w:hAnsi="Times New Roman"/>
                 <w:sz w:val="20"/>
               </w:rPr>
-              <w:t>Centralised all assignment business-rule constants into a dedicated assignment_config.py module and created a companion ASSIGNMENT_RULES.md file that is loaded at every system startup as the authoritative rules reference. This separates operational parameters from application logic, allowing rules to be updated without modifying core engine code, and gives the operations team a single readable document to review and approve rule changes.</w:t>
+              <w:t>Refactored all assignment business-rule constants into a centralised configuration module (assignment_config.py) and created a companion rules reference file (ASSIGNMENT_RULES.md) loaded at system startup, separating operational parameters from engine logic to enable rule updates without code changes.</w:t>
             </w:r>
           </w:p>
           <w:p>
@@ -396,7 +396,7 @@
                 <w:rFonts w:ascii="Times New Roman" w:hAnsi="Times New Roman"/>
                 <w:sz w:val="20"/>
               </w:rPr>
-              <w:t>Introduced data-driven preferred lorry configuration, replacing hardcoded lorry-to-route mappings with a table-driven lookup. Added support for REMARKS FIELD tonnage caps, allowing delivery orders to specify a maximum lorry size via free-text remarks, with the parser handling variable phrasing such as 'BELOW OR 5 TON LORRY' and similar natural-language variants.</w:t>
+              <w:t>Replaced hardcoded lorry-to-route mappings with a data-driven preferred lorry lookup table, and added a free-text tonnage cap parser to the remarks field supporting variable natural-language phrasings.</w:t>
             </w:r>
           </w:p>
           <w:p>
@@ -409,7 +409,7 @@
                 <w:rFonts w:ascii="Times New Roman" w:hAnsi="Times New Roman"/>
                 <w:sz w:val="20"/>
               </w:rPr>
-              <w:t>Refactored the assignment merge logic to prioritise route matching first, then same-city consolidation, and finally same-state grouping by nearest longitude. Added support for same-route-prefix sub-buckets to be pre-merged before cross-route grouping, resolving a split issue where the KV01A route was being divided across two lorries instead of consolidated.</w:t>
+              <w:t>Refactored the DO merge logic to apply a three-level priority: route match first, same-city consolidation second, and same-state nearest-longitude grouping third. Added a pre-merge pass for same-route-prefix sub-buckets to resolve incorrect route splitting.</w:t>
             </w:r>
           </w:p>
           <w:p>
@@ -422,7 +422,7 @@
                 <w:rFonts w:ascii="Times New Roman" w:hAnsi="Times New Roman"/>
                 <w:sz w:val="20"/>
               </w:rPr>
-              <w:t>Integrated OSRM road-distance routing using the OpenStreetMap road network as the primary stop-ordering method, with haversine straight-line distance as a fallback when OSRM is unavailable. Replaced the previous latitude-sweep stop ordering with a greedy nearest-neighbour algorithm that sequences manifest stops from the depot outward by actual road travel distance, improving route efficiency and reducing total trip distance.</w:t>
+              <w:t>Integrated OSRM road-network routing as the primary stop-sequencing method with haversine as fallback, and replaced the latitude-sweep ordering with a greedy nearest-neighbour algorithm to minimise total trip distance in the generated manifests.</w:t>
             </w:r>
           </w:p>
           <w:p>
@@ -435,7 +435,7 @@
                 <w:rFonts w:ascii="Times New Roman" w:hAnsi="Times New Roman"/>
                 <w:sz w:val="20"/>
               </w:rPr>
-              <w:t>Enhanced the trip manifest to include a RETURN TO HQ row at the end of each lorry's stop list and a round-trip estimated time of arrival (ETA) summary, giving drivers a clearer picture of the expected total journey time and confirming the final return leg of each trip.</w:t>
+              <w:t>Added a return-to-depot row and round-trip ETA summary to trip manifests, and fixed stop-ordering to use a principal-axis geographic sweep instead of single-dimension coordinate sorting.</w:t>
             </w:r>
           </w:p>
           <w:p>
@@ -448,7 +448,7 @@
                 <w:rFonts w:ascii="Times New Roman" w:hAnsi="Times New Roman"/>
                 <w:sz w:val="20"/>
               </w:rPr>
-              <w:t>Fixed multiple geographic stop-ordering bugs in the trip manifest, replacing incorrect longitude-only sorting with a principal-axis geographic sweep that correctly sequences stops from HQ outward in the actual direction of travel, avoiding the zigzag patterns produced by the previous one-dimensional sort.</w:t>
+              <w:t>Resolved a state-compatibility exclusion bug causing eligible lorries to be incorrectly filtered on multi-state route buckets, and corrected preferred-owner logic to treat owner assignment as a hard constraint with fallback only on full capacity.</w:t>
             </w:r>
           </w:p>
           <w:p>
@@ -461,20 +461,7 @@
                 <w:rFonts w:ascii="Times New Roman" w:hAnsi="Times New Roman"/>
                 <w:sz w:val="20"/>
               </w:rPr>
-              <w:t>Resolved a state-compatibility exclusion bug in the NO_ELIGIBLE_LORRY path where multi-state route buckets were incorrectly filtering out compatible lorries. Fixed lorry preferred-owner logic to treat owner assignment as a hard constraint rather than a soft hint, falling back to other lorries only when all owner-lorries are at capacity.</w:t>
-            </w:r>
-          </w:p>
-          <w:p>
-            <w:pPr>
-              <w:pStyle w:val="ListBullet"/>
-              <w:spacing w:before="0" w:after="80"/>
-            </w:pPr>
-            <w:r>
-              <w:rPr>
-                <w:rFonts w:ascii="Times New Roman" w:hAnsi="Times New Roman"/>
-                <w:sz w:val="20"/>
-              </w:rPr>
-              <w:t>Wrote and published a comprehensive Operator and Maintenance Manual covering the full system architecture, WhatsApp user menu flow, all assignment rules, master data file formats, external service dependencies, environment variable configuration, restart procedures, maintenance instructions, troubleshooting steps, and quick reference cards for both operators and the maintenance engineer.</w:t>
+              <w:t>Wrote and published a comprehensive operator and maintenance manual covering system architecture, assignment rules, data file formats, deployment configuration, restart procedures, and troubleshooting reference.</w:t>
             </w:r>
           </w:p>
         </w:tc>
@@ -513,7 +500,7 @@
                 <w:rFonts w:ascii="Times New Roman" w:hAnsi="Times New Roman"/>
                 <w:sz w:val="20"/>
               </w:rPr>
-              <w:t>Fixed preferred lorry configuration for specific routes: BPE9788 is now reserved strictly for the PH (Pahang) route, the ABI lorry is configured as the fallback for KV14A, and the TR02 route strict assignment is enforced correctly. These corrections were identified through planner feedback during live operations where the wrong lorries were being suggested for familiar routes.</w:t>
+              <w:t>Corrected route-specific preferred lorry configurations where incorrect fallback lorries were being selected, ensuring strict assignment rules are enforced per route.</w:t>
             </w:r>
           </w:p>
           <w:p>
@@ -526,7 +513,7 @@
                 <w:rFonts w:ascii="Times New Roman" w:hAnsi="Times New Roman"/>
                 <w:sz w:val="20"/>
               </w:rPr>
-              <w:t>Fixed two lorry-contamination bugs that were causing outstation-assigned lorries to appear in urban route assignments. The first bug allowed a lorry with an existing outstation booking to be selected for a Klang Valley DO when its outstation route overlapped with an urban route prefix. The second bug occurred during the overflow reassignment pass, where lorries already committed to outstation trips were incorrectly considered available for urban overflow.</w:t>
+              <w:t>Fixed two vehicle-contamination bugs where lorries already committed to one route class were incorrectly considered available for a different class during both primary and overflow assignment passes.</w:t>
             </w:r>
           </w:p>
           <w:p>
@@ -539,7 +526,7 @@
                 <w:rFonts w:ascii="Times New Roman" w:hAnsi="Times New Roman"/>
                 <w:sz w:val="20"/>
               </w:rPr>
-              <w:t>Implemented automatic splitting of oversized single delivery orders that exceed the maximum capacity of any single lorry. Previously, a DO that was too heavy for even the largest available lorry would be flagged as NO_LORRY with no resolution. The system now splits such DOs across multiple lorries proportionally, ensuring all items are assigned and nothing is left undelivered due to size constraints.</w:t>
+              <w:t>Implemented automatic proportional splitting of oversized single delivery orders that exceed the maximum capacity of any available vehicle, replacing the previous unresolvable NO_LORRY outcome with a multi-vehicle assignment.</w:t>
             </w:r>
           </w:p>
         </w:tc>
@@ -1122,7 +1109,7 @@
                 <w:rFonts w:ascii="Times New Roman" w:hAnsi="Times New Roman"/>
                 <w:sz w:val="20"/>
               </w:rPr>
-              <w:t>Conducted structured user acceptance testing (UAT) sessions with the logistics planning team and lorry coordinators, running the deployed system against a full week of historical daily DO data to validate assignment accuracy and trip manifest correctness. Documented all cases where the system output differed from what an experienced planner would manually assign, and categorised them by root cause for targeted rule improvements.</w:t>
+              <w:t>Conducted user acceptance testing (UAT) by running the system against historical daily data to validate assignment accuracy and manifest correctness. Documented and categorised output discrepancies by root cause for targeted rule refinement.</w:t>
             </w:r>
           </w:p>
           <w:p>
@@ -1135,7 +1122,7 @@
                 <w:rFonts w:ascii="Times New Roman" w:hAnsi="Times New Roman"/>
                 <w:sz w:val="20"/>
               </w:rPr>
-              <w:t>Analysed patterns in the NO_LORRY and NO_ELIGIBLE_LORRY assignment failures collected during UAT and live operations, identifying routes and weight combinations that consistently fall outside the current fleet capacity model. Proposed and began implementing an extended fallback assignment strategy that considers partial-day lorry availability and shared-load arrangements between routes as additional resolution options.</w:t>
+              <w:t>Analysed recurring NO_LORRY and NO_ELIGIBLE_LORRY failure patterns from live and UAT data to identify weight and route combinations outside the current fleet capacity model, and began implementing an extended fallback resolution strategy.</w:t>
             </w:r>
           </w:p>
           <w:p>
@@ -1148,7 +1135,7 @@
                 <w:rFonts w:ascii="Times New Roman" w:hAnsi="Times New Roman"/>
                 <w:sz w:val="20"/>
               </w:rPr>
-              <w:t>Refined the remarks parsing engine to handle a broader range of free-text delivery restriction phrases encountered in real operational data, including bilingual and mixed-language entries combining Malay and English within the same remarks field. Extended the parser's negation detection to correctly handle compound clauses such as 'JANGAN HANTAR ISNIN DAN SELASA' without misclassifying the negation scope.</w:t>
+              <w:t>Extended the remarks parser to handle a wider set of free-text delivery restriction phrases, including bilingual entries, and improved negation detection to correctly scope compound restriction clauses.</w:t>
             </w:r>
           </w:p>
         </w:tc>
@@ -1187,7 +1174,7 @@
                 <w:rFonts w:ascii="Times New Roman" w:hAnsi="Times New Roman"/>
                 <w:sz w:val="20"/>
               </w:rPr>
-              <w:t>Developed a daily operations summary report feature that generates a concise WhatsApp-formatted text summary at the end of each assignment session, listing total DOs assigned, lorries utilised, average load percentage per lorry, and any unresolved NO_LORRY items. This gives the logistics manager a one-tap end-of-day snapshot without needing to open the exported Excel files.</w:t>
+              <w:t>Developed an end-of-session summary generation feature that produces a structured text report of total orders assigned, vehicles utilised, average load percentage, and unresolved items, delivered via WhatsApp at session close.</w:t>
             </w:r>
           </w:p>
           <w:p>
@@ -1200,7 +1187,7 @@
                 <w:rFonts w:ascii="Times New Roman" w:hAnsi="Times New Roman"/>
                 <w:sz w:val="20"/>
               </w:rPr>
-              <w:t>Prepared internal handover documentation covering the system's codebase structure, deployment configuration on the Windows server, ngrok tunnel management, Meta Cloud API token renewal procedure, and common troubleshooting scenarios. The documentation is written to enable a non-developer operations staff member to perform routine maintenance and restart the system independently after the internship period ends.</w:t>
+              <w:t>Prepared system handover documentation covering codebase structure, server deployment configuration, tunnel management, API token renewal, and common failure recovery procedures to support independent operation after the internship period.</w:t>
             </w:r>
           </w:p>
         </w:tc>

</xml_diff>

<commit_message>
Expand report bullet points with more technical detail
</commit_message>
<xml_diff>
--- a/June_July_2026_REPORT_OOI_YU_ZHEN.docx
+++ b/June_July_2026_REPORT_OOI_YU_ZHEN.docx
@@ -227,7 +227,7 @@
                 <w:rFonts w:ascii="Times New Roman" w:hAnsi="Times New Roman"/>
                 <w:sz w:val="20"/>
               </w:rPr>
-              <w:t>Monitored the deployed WhatsApp-based lorry assignment system during its initial live operation period. Verified end-to-end message flow, file exchange, and assignment output correctness under real daily usage conditions.</w:t>
+              <w:t>Monitored the WhatsApp-based lorry assignment system during its initial live operation period following deployment. Tracked end-to-end message flow across the webhook server, Meta Cloud API, and file exchange pipeline to verify that inbound delivery order files were being processed correctly and that assignment outputs and trip manifests were being returned to users as expected under real daily workload conditions.</w:t>
             </w:r>
           </w:p>
           <w:p>
@@ -240,7 +240,7 @@
                 <w:rFonts w:ascii="Times New Roman" w:hAnsi="Times New Roman"/>
                 <w:sz w:val="20"/>
               </w:rPr>
-              <w:t>Investigated and identified root causes for post-deployment defects surfaced during live usage, including incorrect date-based filtering in the remarks parser and session state persistence issues in the daily assignment log.</w:t>
+              <w:t>Investigated post-deployment defects surfaced during live usage. Identified a root cause in the remarks field parser where date-based delivery restrictions were being incorrectly evaluated against the wrong reference date, causing valid orders to be filtered out before assignment. Also diagnosed a session state persistence issue where the daily assignment log was not being correctly retained between bot reconnection events, leading to duplicate assignments.</w:t>
             </w:r>
           </w:p>
           <w:p>
@@ -253,7 +253,7 @@
                 <w:rFonts w:ascii="Times New Roman" w:hAnsi="Times New Roman"/>
                 <w:sz w:val="20"/>
               </w:rPr>
-              <w:t>Reviewed the full assignment rule set against live operational data and documented a prioritised list of rule inconsistencies and edge cases for the next development iteration.</w:t>
+              <w:t>Reviewed the full set of assignment rules against live operational data and cross-referenced system outputs with expected assignment results. Compiled a prioritised list of rule inconsistencies and unhandled edge cases across route boundary enforcement, capacity utilisation thresholds, and preferred-vehicle override behaviour to be addressed in the next development cycle.</w:t>
             </w:r>
           </w:p>
         </w:tc>
@@ -292,7 +292,7 @@
                 <w:rFonts w:ascii="Times New Roman" w:hAnsi="Times New Roman"/>
                 <w:sz w:val="20"/>
               </w:rPr>
-              <w:t>Implemented a route-direction guard across all assignment and overflow passes to prevent geographically opposing delivery orders from being co-assigned to the same vehicle, resolving incorrect multi-directional grouping.</w:t>
+              <w:t>Implemented a route-direction guard across all delivery order consolidation and overflow assignment passes. The guard uses bearing-based geographic classification to prevent orders destined for geographically opposing directions from being co-assigned to the same vehicle, resolving an engine defect that was producing multi-directional trip manifests with excessive backtracking.</w:t>
             </w:r>
           </w:p>
           <w:p>
@@ -305,7 +305,7 @@
                 <w:rFonts w:ascii="Times New Roman" w:hAnsi="Times New Roman"/>
                 <w:sz w:val="20"/>
               </w:rPr>
-              <w:t>Fixed the capacity utilisation threshold logic to correctly enforce an 80% load target before triggering a vehicle upgrade split, and corrected the fill pass to consolidate partial loads up to the threshold before allocating overflow to a second unit.</w:t>
+              <w:t>Fixed the vehicle capacity utilisation threshold logic to correctly enforce an 80% load fill target before triggering a capacity upgrade split. Corrected the fill-to-threshold pass so that partial loads from multiple orders are accumulated and consolidated up to the utilisation target before any overflow is allocated to a second vehicle, preventing unnecessary under-loaded dispatches.</w:t>
             </w:r>
           </w:p>
           <w:p>
@@ -318,7 +318,7 @@
                 <w:rFonts w:ascii="Times New Roman" w:hAnsi="Times New Roman"/>
                 <w:sz w:val="20"/>
               </w:rPr>
-              <w:t>Added earliest-date-first ordering across all assignment passes to ensure older outstanding orders are prioritised over newer ones when fleet capacity is limited.</w:t>
+              <w:t>Added earliest-date-first ordering to all assignment passes so that delivery orders with earlier scheduled dates are always evaluated and assigned before more recent ones. This prevents newly uploaded orders from displacing older outstanding ones when total order weight approaches fleet capacity limits.</w:t>
             </w:r>
           </w:p>
           <w:p>
@@ -331,7 +331,7 @@
                 <w:rFonts w:ascii="Times New Roman" w:hAnsi="Times New Roman"/>
                 <w:sz w:val="20"/>
               </w:rPr>
-              <w:t>Tightened the urban route guard to enforce corridor-group-only merging, blocking cross-corridor co-assignment even between routes of the same classification.</w:t>
+              <w:t>Tightened the urban route merging guard to enforce corridor-group-only consolidation, so that orders belonging to different geographic corridor groups cannot be merged onto the same vehicle even when both are classified under the same broad route category. This closed a gap where orders from opposite ends of the urban delivery zone were being incorrectly co-assigned.</w:t>
             </w:r>
           </w:p>
           <w:p>
@@ -344,7 +344,7 @@
                 <w:rFonts w:ascii="Times New Roman" w:hAnsi="Times New Roman"/>
                 <w:sz w:val="20"/>
               </w:rPr>
-              <w:t>Fixed the date selection flow to correctly include Saturday as a working day while excluding Sunday only.</w:t>
+              <w:t>Corrected the date selection flow in the WhatsApp button interface to include Saturday as a valid selectable working day while continuing to exclude Sunday, aligning the system's date logic with the actual six-day working week.</w:t>
             </w:r>
           </w:p>
         </w:tc>
@@ -383,7 +383,7 @@
                 <w:rFonts w:ascii="Times New Roman" w:hAnsi="Times New Roman"/>
                 <w:sz w:val="20"/>
               </w:rPr>
-              <w:t>Refactored all assignment business-rule constants into a centralised configuration module (assignment_config.py) and created a companion rules reference file (ASSIGNMENT_RULES.md) loaded at system startup, separating operational parameters from engine logic to enable rule updates without code changes.</w:t>
+              <w:t>Refactored all assignment engine business-rule constants out of the core logic modules and into a dedicated centralised configuration file (assignment_config.py). Created a companion human-readable rules reference (ASSIGNMENT_RULES.md) that is loaded at every system startup, enabling operational rule parameters to be reviewed and updated independently of application code without requiring code changes or redeployment.</w:t>
             </w:r>
           </w:p>
           <w:p>
@@ -396,7 +396,7 @@
                 <w:rFonts w:ascii="Times New Roman" w:hAnsi="Times New Roman"/>
                 <w:sz w:val="20"/>
               </w:rPr>
-              <w:t>Replaced hardcoded lorry-to-route mappings with a data-driven preferred lorry lookup table, and added a free-text tonnage cap parser to the remarks field supporting variable natural-language phrasings.</w:t>
+              <w:t>Replaced hardcoded vehicle-to-route mapping tables with a data-driven preferred vehicle lookup that reads configuration from a master data file at runtime. Extended the delivery order remarks parser to extract free-text vehicle size cap instructions and normalise them to a standard tonnage constraint, handling variable natural-language phrasings through token classification rather than fixed pattern matching.</w:t>
             </w:r>
           </w:p>
           <w:p>
@@ -409,7 +409,7 @@
                 <w:rFonts w:ascii="Times New Roman" w:hAnsi="Times New Roman"/>
                 <w:sz w:val="20"/>
               </w:rPr>
-              <w:t>Refactored the DO merge logic to apply a three-level priority: route match first, same-city consolidation second, and same-state nearest-longitude grouping third. Added a pre-merge pass for same-route-prefix sub-buckets to resolve incorrect route splitting.</w:t>
+              <w:t>Refactored the delivery order merge and consolidation logic to apply a three-level priority hierarchy: exact route match first, same-city grouping second, and same-state nearest-coordinate grouping third. Added a pre-merge pass that consolidates same-route-prefix sub-buckets before cross-route grouping is attempted, resolving a defect where orders sharing a common route prefix were being incorrectly split across separate vehicles.</w:t>
             </w:r>
           </w:p>
           <w:p>
@@ -422,7 +422,7 @@
                 <w:rFonts w:ascii="Times New Roman" w:hAnsi="Times New Roman"/>
                 <w:sz w:val="20"/>
               </w:rPr>
-              <w:t>Integrated OSRM road-network routing as the primary stop-sequencing method with haversine as fallback, and replaced the latitude-sweep ordering with a greedy nearest-neighbour algorithm to minimise total trip distance in the generated manifests.</w:t>
+              <w:t>Integrated OSRM road-network distance routing using the OpenStreetMap dataset as the primary stop-sequencing method, with haversine great-circle distance as an automatic fallback when the routing service is unavailable. Replaced the previous single-axis coordinate sweep with a greedy nearest-neighbour algorithm that sequences trip manifest stops from the depot outward along actual road paths, reducing total estimated trip distance.</w:t>
             </w:r>
           </w:p>
           <w:p>
@@ -435,7 +435,7 @@
                 <w:rFonts w:ascii="Times New Roman" w:hAnsi="Times New Roman"/>
                 <w:sz w:val="20"/>
               </w:rPr>
-              <w:t>Added a return-to-depot row and round-trip ETA summary to trip manifests, and fixed stop-ordering to use a principal-axis geographic sweep instead of single-dimension coordinate sorting.</w:t>
+              <w:t>Extended the trip manifest output to include a return-to-depot entry at the end of each vehicle's stop list and a round-trip estimated time summary. Fixed the stop-ordering algorithm to use a principal-axis geographic sweep that correctly sequences stops in the actual direction of travel from the depot, replacing a defective single-dimension coordinate sort that produced zigzag routing patterns.</w:t>
             </w:r>
           </w:p>
           <w:p>
@@ -448,7 +448,7 @@
                 <w:rFonts w:ascii="Times New Roman" w:hAnsi="Times New Roman"/>
                 <w:sz w:val="20"/>
               </w:rPr>
-              <w:t>Resolved a state-compatibility exclusion bug causing eligible lorries to be incorrectly filtered on multi-state route buckets, and corrected preferred-owner logic to treat owner assignment as a hard constraint with fallback only on full capacity.</w:t>
+              <w:t>Resolved a state-compatibility exclusion defect in the no-eligible-vehicle resolution path where multi-state route buckets were incorrectly excluding compatible vehicles based on a misapplied state filter. Corrected the preferred-owner vehicle logic to enforce owner assignment as a hard constraint, with fallback to non-owner vehicles triggered only when all owner-assigned vehicles are confirmed at full capacity.</w:t>
             </w:r>
           </w:p>
           <w:p>
@@ -461,7 +461,7 @@
                 <w:rFonts w:ascii="Times New Roman" w:hAnsi="Times New Roman"/>
                 <w:sz w:val="20"/>
               </w:rPr>
-              <w:t>Wrote and published a comprehensive operator and maintenance manual covering system architecture, assignment rules, data file formats, deployment configuration, restart procedures, and troubleshooting reference.</w:t>
+              <w:t>Wrote and published a comprehensive operator and maintenance manual documenting the complete system architecture, WhatsApp interaction flow, assignment rule set, master data file formats and update procedures, external API dependencies, environment configuration, service restart commands, maintenance workflows, troubleshooting procedures, and quick-reference cards for both daily operators and the system maintainer.</w:t>
             </w:r>
           </w:p>
         </w:tc>
@@ -500,7 +500,7 @@
                 <w:rFonts w:ascii="Times New Roman" w:hAnsi="Times New Roman"/>
                 <w:sz w:val="20"/>
               </w:rPr>
-              <w:t>Corrected route-specific preferred lorry configurations where incorrect fallback lorries were being selected, ensuring strict assignment rules are enforced per route.</w:t>
+              <w:t>Corrected route-specific preferred vehicle configuration entries where incorrect fallback vehicles were being selected during assignment. Enforced strict per-route vehicle reservation rules and validated the corrected configuration against historical assignment data to confirm that the expected vehicles are being selected consistently across different load scenarios.</w:t>
             </w:r>
           </w:p>
           <w:p>
@@ -513,7 +513,7 @@
                 <w:rFonts w:ascii="Times New Roman" w:hAnsi="Times New Roman"/>
                 <w:sz w:val="20"/>
               </w:rPr>
-              <w:t>Fixed two vehicle-contamination bugs where lorries already committed to one route class were incorrectly considered available for a different class during both primary and overflow assignment passes.</w:t>
+              <w:t>Fixed two vehicle-contamination defects that were causing vehicles already committed to one route class to be incorrectly considered available for a different route class. The first defect occurred during the primary assignment pass when route prefix overlap caused an outstation-committed vehicle to match an urban route. The second defect occurred during the overflow reassignment pass where already-committed vehicles were not being excluded from the available pool.</w:t>
             </w:r>
           </w:p>
           <w:p>
@@ -526,7 +526,7 @@
                 <w:rFonts w:ascii="Times New Roman" w:hAnsi="Times New Roman"/>
                 <w:sz w:val="20"/>
               </w:rPr>
-              <w:t>Implemented automatic proportional splitting of oversized single delivery orders that exceed the maximum capacity of any available vehicle, replacing the previous unresolvable NO_LORRY outcome with a multi-vehicle assignment.</w:t>
+              <w:t>Implemented automatic proportional splitting for oversized single delivery orders whose total weight exceeds the capacity of any single available vehicle. The engine now distributes such orders across multiple vehicles in proportion to their available remaining capacity, replacing the previous behaviour where such orders were left permanently unresolved in the output with a no-vehicle flag.</w:t>
             </w:r>
           </w:p>
         </w:tc>
@@ -1109,7 +1109,7 @@
                 <w:rFonts w:ascii="Times New Roman" w:hAnsi="Times New Roman"/>
                 <w:sz w:val="20"/>
               </w:rPr>
-              <w:t>Conducted user acceptance testing (UAT) by running the system against historical daily data to validate assignment accuracy and manifest correctness. Documented and categorised output discrepancies by root cause for targeted rule refinement.</w:t>
+              <w:t>Conducted user acceptance testing (UAT) by executing the system against a set of historical daily delivery order files to validate end-to-end assignment correctness and trip manifest accuracy. Documented all cases where system output diverged from expected results, categorised each discrepancy by root cause, and produced a structured defect list for targeted rule and engine refinement.</w:t>
             </w:r>
           </w:p>
           <w:p>
@@ -1122,7 +1122,7 @@
                 <w:rFonts w:ascii="Times New Roman" w:hAnsi="Times New Roman"/>
                 <w:sz w:val="20"/>
               </w:rPr>
-              <w:t>Analysed recurring NO_LORRY and NO_ELIGIBLE_LORRY failure patterns from live and UAT data to identify weight and route combinations outside the current fleet capacity model, and began implementing an extended fallback resolution strategy.</w:t>
+              <w:t>Analysed recurring unresolved assignment failure patterns collected from both UAT runs and live operational data to identify the specific order weight and route combinations that fall outside the current fleet capacity model. Investigated the engine's fallback resolution paths and began implementing an extended fallback strategy to handle these cases through alternative vehicle selection logic rather than leaving orders unassigned.</w:t>
             </w:r>
           </w:p>
           <w:p>
@@ -1135,7 +1135,7 @@
                 <w:rFonts w:ascii="Times New Roman" w:hAnsi="Times New Roman"/>
                 <w:sz w:val="20"/>
               </w:rPr>
-              <w:t>Extended the remarks parser to handle a wider set of free-text delivery restriction phrases, including bilingual entries, and improved negation detection to correctly scope compound restriction clauses.</w:t>
+              <w:t>Extended the delivery remarks parser to correctly handle a wider range of free-text restriction phrase formats encountered in real data, including bilingual entries mixing multiple languages within the same field. Improved the negation detection logic to correctly identify and scope compound restriction clauses, preventing misclassification of negated delivery day restrictions.</w:t>
             </w:r>
           </w:p>
         </w:tc>
@@ -1174,7 +1174,7 @@
                 <w:rFonts w:ascii="Times New Roman" w:hAnsi="Times New Roman"/>
                 <w:sz w:val="20"/>
               </w:rPr>
-              <w:t>Developed an end-of-session summary generation feature that produces a structured text report of total orders assigned, vehicles utilised, average load percentage, and unresolved items, delivered via WhatsApp at session close.</w:t>
+              <w:t>Developed an end-of-session summary generation feature that compiles a structured report at the close of each assignment session, covering total orders processed, vehicles assigned, load utilisation percentage per vehicle, and any unresolved items remaining. The summary is formatted and delivered via the existing WhatsApp messaging interface, providing an immediate overview of the day's assignment results without requiring the user to open exported files.</w:t>
             </w:r>
           </w:p>
           <w:p>
@@ -1187,7 +1187,7 @@
                 <w:rFonts w:ascii="Times New Roman" w:hAnsi="Times New Roman"/>
                 <w:sz w:val="20"/>
               </w:rPr>
-              <w:t>Prepared system handover documentation covering codebase structure, server deployment configuration, tunnel management, API token renewal, and common failure recovery procedures to support independent operation after the internship period.</w:t>
+              <w:t>Prepared system handover documentation covering the full codebase structure, production server deployment configuration, tunnel service management, external API credential renewal procedures, and step-by-step recovery instructions for common failure scenarios. The documentation is written to enable routine system maintenance and restart to be carried out independently by non-developer staff following the end of the internship period.</w:t>
             </w:r>
           </w:p>
         </w:tc>

</xml_diff>